<commit_message>
Align data and docs with AI and agent nativity pivot
Co-authored-by: IamAmasai <94358022+IamAmasai@users.noreply.github.com>
</commit_message>
<xml_diff>
--- a/Ansai_Company_Overview_v2.docx
+++ b/Ansai_Company_Overview_v2.docx
@@ -38,13 +38,7 @@
         <w:spacing w:before="0" w:after="320"/>
       </w:pPr>
       <w:r>
-        <w:rPr>
-          <w:rFonts w:ascii="Arial" w:cs="Arial" w:eastAsia="Arial" w:hAnsi="Arial"/>
-          <w:color w:val="555555"/>
-          <w:sz w:val="22"/>
-          <w:szCs w:val="22"/>
-        </w:rPr>
-        <w:t xml:space="preserve">The operational infrastructure platform for Africa.</w:t>
+        <w:t>The agentic infrastructure platform for Africa.</w:t>
       </w:r>
     </w:p>
     <w:p>
@@ -304,13 +298,7 @@
         <w:spacing w:before="80" w:after="80"/>
       </w:pPr>
       <w:r>
-        <w:rPr>
-          <w:rFonts w:ascii="Arial" w:cs="Arial" w:eastAsia="Arial" w:hAnsi="Arial"/>
-          <w:color w:val="1A1A1A"/>
-          <w:sz w:val="22"/>
-          <w:szCs w:val="22"/>
-        </w:rPr>
-        <w:t xml:space="preserve">Ansai Technologies is the operational infrastructure platform for Africa.</w:t>
+        <w:t>Ansai Technologies is the agentic infrastructure platform for Africa.</w:t>
       </w:r>
     </w:p>
     <w:p>
@@ -433,16 +421,7 @@
         <w:spacing w:before="320" w:after="80"/>
       </w:pPr>
       <w:r>
-        <w:rPr>
-          <w:rFonts w:ascii="Arial" w:cs="Arial" w:eastAsia="Arial" w:hAnsi="Arial"/>
-          <w:b/>
-          <w:bCs/>
-          <w:caps/>
-          <w:color w:val="1B3FAB"/>
-          <w:sz w:val="18"/>
-          <w:szCs w:val="18"/>
-        </w:rPr>
-        <w:t xml:space="preserve">What operational infrastructure means</w:t>
+        <w:t>What agentic infrastructure means</w:t>
       </w:r>
     </w:p>
     <w:p>
@@ -806,13 +785,7 @@
           </w:tcPr>
           <w:p>
             <w:r>
-              <w:rPr>
-                <w:rFonts w:ascii="Arial" w:cs="Arial" w:eastAsia="Arial" w:hAnsi="Arial"/>
-                <w:color w:val="1A1A1A"/>
-                <w:sz w:val="20"/>
-                <w:szCs w:val="20"/>
-              </w:rPr>
-              <w:t xml:space="preserve">Transport and logistics operational infrastructure for African institutions. [Horizon]</w:t>
+              <w:t>Transport and logistics agentic infrastructure for African institutions. [Horizon]</w:t>
             </w:r>
           </w:p>
         </w:tc>

</xml_diff>